<commit_message>
Scope access to each settlement
</commit_message>
<xml_diff>
--- a/SRS.docx
+++ b/SRS.docx
@@ -47,6 +47,7 @@
       <w:tr>
         <w:trPr>
           <w:tblHeader/>
+          <w:cantSplit/>
         </w:trPr>
         <w:tc>
           <w:tcPr>
@@ -130,6 +131,9 @@
         </w:tc>
       </w:tr>
       <w:tr>
+        <w:trPr>
+          <w:cantSplit/>
+        </w:trPr>
         <w:tc>
           <w:tcPr>
             <w:tcW w:w="2235" w:type="dxa"/>
@@ -176,6 +180,9 @@
         </w:tc>
       </w:tr>
       <w:tr>
+        <w:trPr>
+          <w:cantSplit/>
+        </w:trPr>
         <w:tc>
           <w:tcPr>
             <w:tcW w:w="2235" w:type="dxa"/>
@@ -222,6 +229,9 @@
         </w:tc>
       </w:tr>
       <w:tr>
+        <w:trPr>
+          <w:cantSplit/>
+        </w:trPr>
         <w:tc>
           <w:tcPr>
             <w:tcW w:w="2235" w:type="dxa"/>
@@ -268,6 +278,9 @@
         </w:tc>
       </w:tr>
       <w:tr>
+        <w:trPr>
+          <w:cantSplit/>
+        </w:trPr>
         <w:tc>
           <w:tcPr>
             <w:tcW w:w="2235" w:type="dxa"/>
@@ -314,6 +327,9 @@
         </w:tc>
       </w:tr>
       <w:tr>
+        <w:trPr>
+          <w:cantSplit/>
+        </w:trPr>
         <w:tc>
           <w:tcPr>
             <w:tcW w:w="2235" w:type="dxa"/>
@@ -372,6 +388,9 @@
         </w:tc>
       </w:tr>
       <w:tr>
+        <w:trPr>
+          <w:cantSplit/>
+        </w:trPr>
         <w:tc>
           <w:tcPr>
             <w:tcW w:w="2235" w:type="dxa"/>
@@ -413,6 +432,51 @@
           <w:p>
             <w:r>
               <w:t>30.08.26</w:t>
+            </w:r>
+          </w:p>
+        </w:tc>
+      </w:tr>
+      <w:tr>
+        <w:trPr>
+          <w:cantSplit/>
+        </w:trPr>
+        <w:tc>
+          <w:tcPr>
+            <w:tcW w:type="dxa" w:w="2235"/>
+          </w:tcPr>
+          <w:p>
+            <w:r>
+              <w:t>0.7</w:t>
+            </w:r>
+          </w:p>
+        </w:tc>
+        <w:tc>
+          <w:tcPr>
+            <w:tcW w:type="dxa" w:w="2235"/>
+          </w:tcPr>
+          <w:p>
+            <w:r>
+              <w:t>Рахматуллин Р.Б.</w:t>
+            </w:r>
+          </w:p>
+        </w:tc>
+        <w:tc>
+          <w:tcPr>
+            <w:tcW w:type="dxa" w:w="2235"/>
+          </w:tcPr>
+          <w:p>
+            <w:r>
+              <w:t>Добавлена тиражируемость для нескольких поселений и изоляция данных по учётной записи</w:t>
+            </w:r>
+          </w:p>
+        </w:tc>
+        <w:tc>
+          <w:tcPr>
+            <w:tcW w:type="dxa" w:w="2235"/>
+          </w:tcPr>
+          <w:p>
+            <w:r>
+              <w:t>02.09.26</w:t>
             </w:r>
           </w:p>
         </w:tc>
@@ -695,6 +759,7 @@
       <w:tr>
         <w:trPr>
           <w:tblHeader/>
+          <w:cantSplit/>
         </w:trPr>
         <w:tc>
           <w:tcPr>
@@ -750,6 +815,9 @@
         </w:tc>
       </w:tr>
       <w:tr>
+        <w:trPr>
+          <w:cantSplit/>
+        </w:trPr>
         <w:tc>
           <w:tcPr>
             <w:tcW w:w="4514" w:type="dxa"/>
@@ -784,6 +852,9 @@
         </w:tc>
       </w:tr>
       <w:tr>
+        <w:trPr>
+          <w:cantSplit/>
+        </w:trPr>
         <w:tc>
           <w:tcPr>
             <w:tcW w:w="4514" w:type="dxa"/>
@@ -819,6 +890,9 @@
         </w:tc>
       </w:tr>
       <w:tr>
+        <w:trPr>
+          <w:cantSplit/>
+        </w:trPr>
         <w:tc>
           <w:tcPr>
             <w:tcW w:w="4514" w:type="dxa"/>
@@ -853,6 +927,9 @@
         </w:tc>
       </w:tr>
       <w:tr>
+        <w:trPr>
+          <w:cantSplit/>
+        </w:trPr>
         <w:tc>
           <w:tcPr>
             <w:tcW w:w="4514" w:type="dxa"/>
@@ -887,6 +964,9 @@
         </w:tc>
       </w:tr>
       <w:tr>
+        <w:trPr>
+          <w:cantSplit/>
+        </w:trPr>
         <w:tc>
           <w:tcPr>
             <w:tcW w:w="4514" w:type="dxa"/>
@@ -921,6 +1001,9 @@
         </w:tc>
       </w:tr>
       <w:tr>
+        <w:trPr>
+          <w:cantSplit/>
+        </w:trPr>
         <w:tc>
           <w:tcPr>
             <w:tcW w:w="4514" w:type="dxa"/>
@@ -955,6 +1038,9 @@
         </w:tc>
       </w:tr>
       <w:tr>
+        <w:trPr>
+          <w:cantSplit/>
+        </w:trPr>
         <w:tc>
           <w:tcPr>
             <w:tcW w:w="4514" w:type="dxa"/>
@@ -989,6 +1075,9 @@
         </w:tc>
       </w:tr>
       <w:tr>
+        <w:trPr>
+          <w:cantSplit/>
+        </w:trPr>
         <w:tc>
           <w:tcPr>
             <w:tcW w:w="4514" w:type="dxa"/>
@@ -1023,6 +1112,9 @@
         </w:tc>
       </w:tr>
       <w:tr>
+        <w:trPr>
+          <w:cantSplit/>
+        </w:trPr>
         <w:tc>
           <w:tcPr>
             <w:tcW w:w="4514" w:type="dxa"/>
@@ -1057,6 +1149,9 @@
         </w:tc>
       </w:tr>
       <w:tr>
+        <w:trPr>
+          <w:cantSplit/>
+        </w:trPr>
         <w:tc>
           <w:tcPr>
             <w:tcW w:w="4514" w:type="dxa"/>
@@ -1091,6 +1186,9 @@
         </w:tc>
       </w:tr>
       <w:tr>
+        <w:trPr>
+          <w:cantSplit/>
+        </w:trPr>
         <w:tc>
           <w:tcPr>
             <w:tcW w:w="4514" w:type="dxa"/>
@@ -1804,11 +1902,9 @@
     </w:p>
     <w:p>
       <w:r>
-        <w:t>2.3.3 Использование системы в рамках одного поселения</w:t>
-      </w:r>
-      <w:r>
-        <w:br/>
-        <w:t>Предполагается, что система используется в рамках одного поселения и не требует взаимодействия с внешними организациями или системами.</w:t>
+        <w:t>2.3.3 Тиражирование для нескольких поселений</w:t>
+        <w:br/>
+        <w:t>Предполагается, что один экземпляр веб-приложения обслуживает несколько поселений-клиентов. Каждая учётная запись относится ровно к одному поселению; после входа пользователь работает только с его данными и не видит другие поселения. Интеграция между поселениями и внешними организациями в базовый объём не входит.</w:t>
       </w:r>
     </w:p>
     <w:p>
@@ -2020,6 +2116,7 @@
       <w:tr>
         <w:trPr>
           <w:tblHeader/>
+          <w:cantSplit/>
         </w:trPr>
         <w:tc>
           <w:tcPr>
@@ -2127,31 +2224,22 @@
         </w:tc>
       </w:tr>
       <w:tr>
-        <w:tc>
-          <w:tcPr>
-            <w:tcW w:w="2257" w:type="dxa"/>
-            <w:tcMar>
-              <w:top w:w="100" w:type="dxa"/>
-              <w:left w:w="100" w:type="dxa"/>
-              <w:bottom w:w="100" w:type="dxa"/>
-              <w:right w:w="100" w:type="dxa"/>
-            </w:tcMar>
-          </w:tcPr>
-          <w:p>
-            <w:r>
-              <w:t>Единый центр управления экспедицией</w:t>
-            </w:r>
-          </w:p>
-        </w:tc>
-        <w:tc>
-          <w:tcPr>
-            <w:tcW w:w="2257" w:type="dxa"/>
-            <w:tcMar>
-              <w:top w:w="100" w:type="dxa"/>
-              <w:left w:w="100" w:type="dxa"/>
-              <w:bottom w:w="100" w:type="dxa"/>
-              <w:right w:w="100" w:type="dxa"/>
-            </w:tcMar>
+        <w:trPr>
+          <w:cantSplit/>
+        </w:trPr>
+        <w:tc>
+          <w:tcPr>
+            <w:tcW w:type="dxa" w:w="2258"/>
+          </w:tcPr>
+          <w:p>
+            <w:r>
+              <w:t>Пространства поселений</w:t>
+            </w:r>
+          </w:p>
+        </w:tc>
+        <w:tc>
+          <w:tcPr>
+            <w:tcW w:type="dxa" w:w="2257"/>
           </w:tcPr>
           <w:p>
             <w:r>
@@ -2161,38 +2249,29 @@
         </w:tc>
         <w:tc>
           <w:tcPr>
-            <w:tcW w:w="2257" w:type="dxa"/>
-            <w:tcMar>
-              <w:top w:w="100" w:type="dxa"/>
-              <w:left w:w="100" w:type="dxa"/>
-              <w:bottom w:w="100" w:type="dxa"/>
-              <w:right w:w="100" w:type="dxa"/>
-            </w:tcMar>
-          </w:tcPr>
-          <w:p>
-            <w:r>
-              <w:t>§3.1.1</w:t>
-            </w:r>
-          </w:p>
-        </w:tc>
-        <w:tc>
-          <w:tcPr>
-            <w:tcW w:w="2257" w:type="dxa"/>
-            <w:tcMar>
-              <w:top w:w="100" w:type="dxa"/>
-              <w:left w:w="100" w:type="dxa"/>
-              <w:bottom w:w="100" w:type="dxa"/>
-              <w:right w:w="100" w:type="dxa"/>
-            </w:tcMar>
-          </w:tcPr>
-          <w:p>
-            <w:r>
-              <w:t>Без создания и управления походами система не выполняет роль управления морскими экспедициями</w:t>
+            <w:tcW w:type="dxa" w:w="2257"/>
+          </w:tcPr>
+          <w:p>
+            <w:r>
+              <w:t>§3.1.7</w:t>
+            </w:r>
+          </w:p>
+        </w:tc>
+        <w:tc>
+          <w:tcPr>
+            <w:tcW w:type="dxa" w:w="2257"/>
+          </w:tcPr>
+          <w:p>
+            <w:r>
+              <w:t>Один экземпляр приложения должен изолировать данные нескольких клиентов</w:t>
             </w:r>
           </w:p>
         </w:tc>
       </w:tr>
       <w:tr>
+        <w:trPr>
+          <w:cantSplit/>
+        </w:trPr>
         <w:tc>
           <w:tcPr>
             <w:tcW w:w="2257" w:type="dxa"/>
@@ -2205,7 +2284,7 @@
           </w:tcPr>
           <w:p>
             <w:r>
-              <w:t>Управление ресурсами</w:t>
+              <w:t>Единый центр управления экспедицией</w:t>
             </w:r>
           </w:p>
         </w:tc>
@@ -2237,7 +2316,7 @@
           </w:tcPr>
           <w:p>
             <w:r>
-              <w:t>§3.1.2</w:t>
+              <w:t>§3.1.1</w:t>
             </w:r>
           </w:p>
         </w:tc>
@@ -2253,12 +2332,15 @@
           </w:tcPr>
           <w:p>
             <w:r>
-              <w:t>Общий пул ресурсов для походов и верфи</w:t>
+              <w:t>Без создания и управления походами система не выполняет роль управления морскими экспедициями</w:t>
             </w:r>
           </w:p>
         </w:tc>
       </w:tr>
       <w:tr>
+        <w:trPr>
+          <w:cantSplit/>
+        </w:trPr>
         <w:tc>
           <w:tcPr>
             <w:tcW w:w="2257" w:type="dxa"/>
@@ -2271,7 +2353,7 @@
           </w:tcPr>
           <w:p>
             <w:r>
-              <w:t>Строительство корабля</w:t>
+              <w:t>Управление ресурсами</w:t>
             </w:r>
           </w:p>
         </w:tc>
@@ -2303,7 +2385,7 @@
           </w:tcPr>
           <w:p>
             <w:r>
-              <w:t>§3.1.5</w:t>
+              <w:t>§3.1.2</w:t>
             </w:r>
           </w:p>
         </w:tc>
@@ -2319,12 +2401,15 @@
           </w:tcPr>
           <w:p>
             <w:r>
-              <w:t>Поэтапная верфь со списанием ресурсов</w:t>
+              <w:t>Общий пул ресурсов для походов и верфи</w:t>
             </w:r>
           </w:p>
         </w:tc>
       </w:tr>
       <w:tr>
+        <w:trPr>
+          <w:cantSplit/>
+        </w:trPr>
         <w:tc>
           <w:tcPr>
             <w:tcW w:w="2257" w:type="dxa"/>
@@ -2337,7 +2422,7 @@
           </w:tcPr>
           <w:p>
             <w:r>
-              <w:t>Учёт результатов и распределение добычи</w:t>
+              <w:t>Строительство корабля</w:t>
             </w:r>
           </w:p>
         </w:tc>
@@ -2369,7 +2454,7 @@
           </w:tcPr>
           <w:p>
             <w:r>
-              <w:t>§3.1.6</w:t>
+              <w:t>§3.1.5</w:t>
             </w:r>
           </w:p>
         </w:tc>
@@ -2385,12 +2470,15 @@
           </w:tcPr>
           <w:p>
             <w:r>
-              <w:t>Фиксация итогов и расчет Вергельда</w:t>
+              <w:t>Поэтапная верфь со списанием ресурсов</w:t>
             </w:r>
           </w:p>
         </w:tc>
       </w:tr>
       <w:tr>
+        <w:trPr>
+          <w:cantSplit/>
+        </w:trPr>
         <w:tc>
           <w:tcPr>
             <w:tcW w:w="2257" w:type="dxa"/>
@@ -2403,7 +2491,7 @@
           </w:tcPr>
           <w:p>
             <w:r>
-              <w:t>Планирование маршрута</w:t>
+              <w:t>Учёт результатов и распределение добычи</w:t>
             </w:r>
           </w:p>
         </w:tc>
@@ -2419,7 +2507,7 @@
           </w:tcPr>
           <w:p>
             <w:r>
-              <w:t>Высокий</w:t>
+              <w:t>Критический</w:t>
             </w:r>
           </w:p>
         </w:tc>
@@ -2435,7 +2523,7 @@
           </w:tcPr>
           <w:p>
             <w:r>
-              <w:t>§3.1.4</w:t>
+              <w:t>§3.1.6</w:t>
             </w:r>
           </w:p>
         </w:tc>
@@ -2451,12 +2539,84 @@
           </w:tcPr>
           <w:p>
             <w:r>
-              <w:t>Роль навигатора; не блокирует остальные функции при поэтапной поставке</w:t>
+              <w:t>Фиксация итогов и расчет Вергельда</w:t>
             </w:r>
           </w:p>
         </w:tc>
       </w:tr>
       <w:tr>
+        <w:trPr>
+          <w:cantSplit/>
+        </w:trPr>
+        <w:tc>
+          <w:tcPr>
+            <w:tcW w:w="2257" w:type="dxa"/>
+            <w:tcMar>
+              <w:top w:w="100" w:type="dxa"/>
+              <w:left w:w="100" w:type="dxa"/>
+              <w:bottom w:w="100" w:type="dxa"/>
+              <w:right w:w="100" w:type="dxa"/>
+            </w:tcMar>
+          </w:tcPr>
+          <w:p>
+            <w:r>
+              <w:t>Планирование маршрута</w:t>
+            </w:r>
+          </w:p>
+        </w:tc>
+        <w:tc>
+          <w:tcPr>
+            <w:tcW w:w="2257" w:type="dxa"/>
+            <w:tcMar>
+              <w:top w:w="100" w:type="dxa"/>
+              <w:left w:w="100" w:type="dxa"/>
+              <w:bottom w:w="100" w:type="dxa"/>
+              <w:right w:w="100" w:type="dxa"/>
+            </w:tcMar>
+          </w:tcPr>
+          <w:p>
+            <w:r>
+              <w:t>Высокий</w:t>
+            </w:r>
+          </w:p>
+        </w:tc>
+        <w:tc>
+          <w:tcPr>
+            <w:tcW w:w="2257" w:type="dxa"/>
+            <w:tcMar>
+              <w:top w:w="100" w:type="dxa"/>
+              <w:left w:w="100" w:type="dxa"/>
+              <w:bottom w:w="100" w:type="dxa"/>
+              <w:right w:w="100" w:type="dxa"/>
+            </w:tcMar>
+          </w:tcPr>
+          <w:p>
+            <w:r>
+              <w:t>§3.1.4</w:t>
+            </w:r>
+          </w:p>
+        </w:tc>
+        <w:tc>
+          <w:tcPr>
+            <w:tcW w:w="2257" w:type="dxa"/>
+            <w:tcMar>
+              <w:top w:w="100" w:type="dxa"/>
+              <w:left w:w="100" w:type="dxa"/>
+              <w:bottom w:w="100" w:type="dxa"/>
+              <w:right w:w="100" w:type="dxa"/>
+            </w:tcMar>
+          </w:tcPr>
+          <w:p>
+            <w:r>
+              <w:t>Роль навигатора; не блокирует остальные функции при поэтапной поставке</w:t>
+            </w:r>
+          </w:p>
+        </w:tc>
+      </w:tr>
+      <w:tr>
+        <w:trPr>
+          <w:cantSplit/>
+        </w:trPr>
         <w:tc>
           <w:tcPr>
             <w:tcW w:w="2257" w:type="dxa"/>
@@ -2624,86 +2784,420 @@
     </w:p>
     <w:p>
       <w:r>
-        <w:t xml:space="preserve">Соответствие блоков: управление походом — </w:t>
-      </w:r>
+        <w:t>Соответствие блоков: управление походом — 3.1.1, ресурсы — 3.1.2, команда — 3.1.3, маршрут — 3.1.4, верфь — 3.1.5, учёт результатов — 3.1.6, пространства поселений — 3.1.7.</w:t>
+      </w:r>
+    </w:p>
+    <w:p>
+      <w:pPr>
+        <w:pStyle w:val="Heading3"/>
+        <w:keepNext/>
+        <w:spacing w:after="160"/>
+      </w:pPr>
+      <w:bookmarkStart w:id="14" w:name="_sll4un37yyxq" w:colFirst="0" w:colLast="0"/>
+      <w:bookmarkEnd w:id="14"/>
       <w:r>
         <w:rPr>
           <w:b/>
           <w:bCs/>
         </w:rPr>
-        <w:t>3.1.1</w:t>
-      </w:r>
-      <w:r>
-        <w:t xml:space="preserve">, ресурсы — </w:t>
-      </w:r>
+        <w:t>3.1.1 Управление походом</w:t>
+      </w:r>
+    </w:p>
+    <w:p>
+      <w:pPr>
+        <w:spacing w:before="80"/>
+      </w:pPr>
+      <w:r>
+        <w:t xml:space="preserve">FR-01 [UC1]: Система должна позволять создавать поход с указанием цели.  </w:t>
+      </w:r>
+    </w:p>
+    <w:p>
+      <w:r>
+        <w:t xml:space="preserve">   </w:t>
+      </w:r>
+    </w:p>
+    <w:p>
+      <w:r>
+        <w:t xml:space="preserve">FR-02 [UC1, UC2, UC5]: Система должна отображать список походов.  </w:t>
+      </w:r>
+    </w:p>
+    <w:p>
+      <w:r>
+        <w:t xml:space="preserve">   </w:t>
+      </w:r>
+    </w:p>
+    <w:p>
+      <w:r>
+        <w:t xml:space="preserve">FR-03 [UC2]: Система должна отображать статус готовности похода (ресурсы, команда, корабль, маршрут).  </w:t>
+      </w:r>
+    </w:p>
+    <w:p>
+      <w:r>
+        <w:t xml:space="preserve">   </w:t>
+      </w:r>
+    </w:p>
+    <w:p>
+      <w:r>
+        <w:t>FR-04 [UC3]: Система должна запрещать запуск похода при отсутствии обязательных условий.</w:t>
+      </w:r>
+    </w:p>
+    <w:p>
+      <w:pPr>
+        <w:pStyle w:val="Heading3"/>
+        <w:keepNext/>
+        <w:spacing w:after="160"/>
+      </w:pPr>
+      <w:bookmarkStart w:id="15" w:name="_jqazpwguif35" w:colFirst="0" w:colLast="0"/>
+      <w:bookmarkEnd w:id="15"/>
       <w:r>
         <w:rPr>
           <w:b/>
           <w:bCs/>
         </w:rPr>
-        <w:t>3.1.2</w:t>
-      </w:r>
-      <w:r>
-        <w:t xml:space="preserve">, команда — </w:t>
-      </w:r>
+        <w:t>3.1.2 Управление ресурсами</w:t>
+      </w:r>
+    </w:p>
+    <w:p>
+      <w:pPr>
+        <w:spacing w:before="80"/>
+      </w:pPr>
+      <w:r>
+        <w:t xml:space="preserve">FR-05 [UC9]: Система должна отображать склад ресурсов.  </w:t>
+      </w:r>
+    </w:p>
+    <w:p>
+      <w:r>
+        <w:t xml:space="preserve">   </w:t>
+      </w:r>
+    </w:p>
+    <w:p>
+      <w:r>
+        <w:t xml:space="preserve">FR-06 [UC9]: Система должна позволять вводить и редактировать ресурсы.  </w:t>
+      </w:r>
+    </w:p>
+    <w:p>
+      <w:r>
+        <w:t xml:space="preserve">   </w:t>
+      </w:r>
+    </w:p>
+    <w:p>
+      <w:r>
+        <w:t xml:space="preserve">FR-07 [UC10, UC11]: Система должна учитывать распределение и резервирование ресурсов между походами и верфью.  </w:t>
+      </w:r>
+    </w:p>
+    <w:p>
+      <w:r>
+        <w:t xml:space="preserve">   </w:t>
+      </w:r>
+    </w:p>
+    <w:p>
+      <w:r>
+        <w:t>FR-08 [UC3, UC11]: Система должна уведомлять о нехватке ресурсов в контексте операции (до выхода в море или до закрытия этапа постройки).</w:t>
+      </w:r>
+    </w:p>
+    <w:p>
+      <w:pPr>
+        <w:pStyle w:val="Heading3"/>
+        <w:keepNext/>
+        <w:spacing w:after="160"/>
+      </w:pPr>
+      <w:bookmarkStart w:id="16" w:name="_by7fuplrn23w" w:colFirst="0" w:colLast="0"/>
+      <w:bookmarkEnd w:id="16"/>
       <w:r>
         <w:rPr>
           <w:b/>
           <w:bCs/>
         </w:rPr>
-        <w:t>3.1.3</w:t>
-      </w:r>
-      <w:r>
-        <w:t xml:space="preserve">, маршрут — </w:t>
-      </w:r>
+        <w:t>3.1.3 Управление командой</w:t>
+      </w:r>
+    </w:p>
+    <w:p>
+      <w:pPr>
+        <w:spacing w:before="80"/>
+      </w:pPr>
+      <w:r>
+        <w:t xml:space="preserve">FR-09 [UC6]: Система должна позволять добавлять участников в поход.  </w:t>
+      </w:r>
+    </w:p>
+    <w:p>
+      <w:r>
+        <w:t xml:space="preserve">   </w:t>
+      </w:r>
+    </w:p>
+    <w:p>
+      <w:r>
+        <w:t xml:space="preserve">FR-10 [UC6]: Система должна позволять назначать роли.  </w:t>
+      </w:r>
+    </w:p>
+    <w:p>
+      <w:r>
+        <w:t xml:space="preserve">   </w:t>
+      </w:r>
+    </w:p>
+    <w:p>
+      <w:r>
+        <w:t xml:space="preserve">FR-11 [UC7]: Система должна фиксировать подтверждение участия.  </w:t>
+      </w:r>
+    </w:p>
+    <w:p>
+      <w:r>
+        <w:t xml:space="preserve">   </w:t>
+      </w:r>
+    </w:p>
+    <w:p>
+      <w:r>
+        <w:t>FR-12 [UC2, UC6]: Система должна отображать состав команды.</w:t>
+      </w:r>
+    </w:p>
+    <w:p>
+      <w:pPr>
+        <w:pStyle w:val="Heading3"/>
+        <w:keepNext/>
+        <w:spacing w:after="160"/>
+      </w:pPr>
+      <w:bookmarkStart w:id="17" w:name="_addjkqrboi0s" w:colFirst="0" w:colLast="0"/>
+      <w:bookmarkEnd w:id="17"/>
       <w:r>
         <w:rPr>
           <w:b/>
           <w:bCs/>
         </w:rPr>
-        <w:t>3.1.4</w:t>
-      </w:r>
-      <w:r>
-        <w:t xml:space="preserve">, верфь — </w:t>
-      </w:r>
+        <w:t>3.1.4 Планирование маршрута</w:t>
+      </w:r>
+    </w:p>
+    <w:p>
+      <w:pPr>
+        <w:spacing w:before="80"/>
+      </w:pPr>
+      <w:r>
+        <w:t xml:space="preserve">FR-13 [UC8]: Система должна позволять задавать маршрут как список точек с описанием, привязанный к походу.  </w:t>
+      </w:r>
+    </w:p>
+    <w:p>
+      <w:r>
+        <w:t xml:space="preserve">   </w:t>
+      </w:r>
+    </w:p>
+    <w:p>
+      <w:r>
+        <w:lastRenderedPageBreak/>
+        <w:t xml:space="preserve">FR-14 [UC8]: Система должна отображать расстояние между точками.  </w:t>
+      </w:r>
+    </w:p>
+    <w:p>
+      <w:r>
+        <w:t xml:space="preserve">   </w:t>
+      </w:r>
+    </w:p>
+    <w:p>
+      <w:r>
+        <w:t xml:space="preserve">FR-15 [UC8]: Система должна позволять редактировать маршрут на этапе подготовки похода.  </w:t>
+      </w:r>
+    </w:p>
+    <w:p>
+      <w:r>
+        <w:t xml:space="preserve">   </w:t>
+      </w:r>
+    </w:p>
+    <w:p>
+      <w:r>
+        <w:t>FR-16 [UC8]: Система не должна использовать внешние картографические сервисы; маршрут задается вручную в системе.</w:t>
+      </w:r>
+    </w:p>
+    <w:p>
+      <w:pPr>
+        <w:pStyle w:val="Heading3"/>
+        <w:keepNext/>
+        <w:spacing w:after="160"/>
+      </w:pPr>
+      <w:bookmarkStart w:id="18" w:name="_km5qb7gndxea" w:colFirst="0" w:colLast="0"/>
+      <w:bookmarkEnd w:id="18"/>
       <w:r>
         <w:rPr>
           <w:b/>
           <w:bCs/>
         </w:rPr>
-        <w:t>3.1.5</w:t>
-      </w:r>
-      <w:r>
-        <w:t xml:space="preserve">, учёт результатов — </w:t>
-      </w:r>
+        <w:t>3.1.5 Строительство корабля</w:t>
+      </w:r>
+    </w:p>
+    <w:p>
+      <w:pPr>
+        <w:spacing w:before="80"/>
+      </w:pPr>
+      <w:r>
+        <w:t xml:space="preserve">FR-17 [UC11]: Система должна поддерживать поэтапное строительство корабля с видимой цепочкой этапов.  </w:t>
+      </w:r>
+    </w:p>
+    <w:p>
+      <w:r>
+        <w:t xml:space="preserve">   </w:t>
+      </w:r>
+    </w:p>
+    <w:p>
+      <w:r>
+        <w:t xml:space="preserve">FR-18 [UC11]: Система должна списывать ресурсы со склада при закрытии этапа.  </w:t>
+      </w:r>
+    </w:p>
+    <w:p>
+      <w:r>
+        <w:t xml:space="preserve">   </w:t>
+      </w:r>
+    </w:p>
+    <w:p>
+      <w:r>
+        <w:t xml:space="preserve">FR-19 [UC11]: Система должна требовать подтверждение этапов строительства.  </w:t>
+      </w:r>
+    </w:p>
+    <w:p>
+      <w:r>
+        <w:t xml:space="preserve">   </w:t>
+      </w:r>
+    </w:p>
+    <w:p>
+      <w:r>
+        <w:t>FR-20 [UC11, UC12]: Система должна запрещать завершение постройки без подтверждения благословения жрецом.</w:t>
+      </w:r>
+    </w:p>
+    <w:p>
+      <w:pPr>
+        <w:pStyle w:val="Heading3"/>
+        <w:keepNext/>
+        <w:spacing w:after="160"/>
+      </w:pPr>
+      <w:bookmarkStart w:id="19" w:name="_td42nzyrzsey" w:colFirst="0" w:colLast="0"/>
+      <w:bookmarkEnd w:id="19"/>
       <w:r>
         <w:rPr>
           <w:b/>
           <w:bCs/>
         </w:rPr>
-        <w:t>3.1.6</w:t>
-      </w:r>
-      <w:r>
-        <w:t>.</w:t>
+        <w:t>3.1.6 Учёт результатов</w:t>
+      </w:r>
+    </w:p>
+    <w:p>
+      <w:pPr>
+        <w:spacing w:before="80"/>
+      </w:pPr>
+      <w:r>
+        <w:t xml:space="preserve">FR-21 [UC4]: Система должна фиксировать добычу по завершённому походу.  </w:t>
+      </w:r>
+    </w:p>
+    <w:p>
+      <w:r>
+        <w:t xml:space="preserve">   </w:t>
+      </w:r>
+    </w:p>
+    <w:p>
+      <w:r>
+        <w:t xml:space="preserve">FR-22 [UC4]: Система должна фиксировать потери.  </w:t>
+      </w:r>
+    </w:p>
+    <w:p>
+      <w:r>
+        <w:t xml:space="preserve">   </w:t>
+      </w:r>
+    </w:p>
+    <w:p>
+      <w:r>
+        <w:t xml:space="preserve">FR-23 [UC4]: Система должна рассчитывать распределение Вергельда (доли добычи участников по правилам поселения).  </w:t>
+      </w:r>
+    </w:p>
+    <w:p>
+      <w:r>
+        <w:t xml:space="preserve">   </w:t>
+      </w:r>
+    </w:p>
+    <w:p>
+      <w:r>
+        <w:t xml:space="preserve">FR-24 [UC5]: Система должна сохранять историю походов.  </w:t>
+      </w:r>
+    </w:p>
+    <w:p>
+      <w:r>
+        <w:t xml:space="preserve">   </w:t>
+      </w:r>
+    </w:p>
+    <w:p>
+      <w:r>
+        <w:t>FR-25 [UC4, UC5]: После фиксации итогов завершённого похода система должна запрещать изменение записи о добыче, потерях и распределении Вергельда пользователями согласно правилам неизменяемости (доступ на чтение — по ролям).</w:t>
       </w:r>
     </w:p>
     <w:p>
       <w:pPr>
         <w:pStyle w:val="Heading3"/>
-      </w:pPr>
-      <w:bookmarkStart w:id="14" w:name="_sll4un37yyxq" w:colFirst="0" w:colLast="0"/>
-      <w:bookmarkEnd w:id="14"/>
+        <w:keepNext/>
+        <w:spacing w:after="160"/>
+      </w:pPr>
+      <w:r>
+        <w:rPr>
+          <w:b/>
+        </w:rPr>
+        <w:t>3.1.7 Пространства поселений</w:t>
+      </w:r>
+    </w:p>
+    <w:p>
+      <w:pPr>
+        <w:spacing w:before="80"/>
+      </w:pPr>
+      <w:r>
+        <w:t>FR-26: Система должна предоставлять защищённую административную операцию подключения нового поселения с созданием первой учётной записи ярла.</w:t>
+      </w:r>
+    </w:p>
+    <w:p>
+      <w:pPr/>
+    </w:p>
+    <w:p>
+      <w:pPr/>
+      <w:r>
+        <w:t>FR-27: При входе система должна автоматически определять поселение по учётной записи пользователя. Пользователь не должен видеть список других поселений или переключаться между ними.</w:t>
+      </w:r>
+    </w:p>
+    <w:p>
+      <w:pPr/>
+    </w:p>
+    <w:p>
+      <w:pPr/>
+      <w:r>
+        <w:t>FR-28: Походы, склад, корабли, состав команды, результаты и история изменений должны относиться к конкретному поселению и быть доступны только пользователям этого поселения.</w:t>
+      </w:r>
+    </w:p>
+    <w:p>
+      <w:pPr>
+        <w:pStyle w:val="Heading2"/>
+      </w:pPr>
+      <w:bookmarkStart w:id="20" w:name="_82p2rm65c6tk" w:colFirst="0" w:colLast="0"/>
+      <w:bookmarkEnd w:id="20"/>
       <w:r>
         <w:rPr>
           <w:b/>
           <w:bCs/>
         </w:rPr>
-        <w:t>3.1.1 Управление походом</w:t>
-      </w:r>
-    </w:p>
-    <w:p>
-      <w:r>
-        <w:t xml:space="preserve">FR-01 [UC1]: Система должна позволять создавать поход с указанием цели.  </w:t>
+        <w:t>3.2 Usability (Требования к удобству использования)</w:t>
+      </w:r>
+    </w:p>
+    <w:p>
+      <w:r>
+        <w:t xml:space="preserve">NFR-01: Для пользователей с ролями ярл, навигатор и кораблестроитель следующие действия должны выполняться не более чем за 2 перехода (клика) от главного экрана роли:  </w:t>
+      </w:r>
+    </w:p>
+    <w:p>
+      <w:r>
+        <w:t xml:space="preserve">●      создание похода;  </w:t>
+      </w:r>
+    </w:p>
+    <w:p>
+      <w:r>
+        <w:t xml:space="preserve">●      просмотр статуса экспедиции;  </w:t>
+      </w:r>
+    </w:p>
+    <w:p>
+      <w:r>
+        <w:t xml:space="preserve">●      редактирование маршрута;  </w:t>
+      </w:r>
+    </w:p>
+    <w:p>
+      <w:r>
+        <w:t xml:space="preserve">●      обновление состояния корабля.  </w:t>
       </w:r>
     </w:p>
     <w:p>
@@ -2713,7 +3207,38 @@
     </w:p>
     <w:p>
       <w:r>
-        <w:t xml:space="preserve">FR-02 [UC1, UC2, UC5]: Система должна отображать список походов.  </w:t>
+        <w:t xml:space="preserve">NFR-02: Система должна отображать пользователю только функции и данные, доступные его роли:  </w:t>
+      </w:r>
+    </w:p>
+    <w:p>
+      <w:r>
+        <w:t xml:space="preserve">●      ярл — полный доступ ко всем модулям;  </w:t>
+      </w:r>
+    </w:p>
+    <w:p>
+      <w:r>
+        <w:lastRenderedPageBreak/>
+        <w:t xml:space="preserve">●      навигатор — доступ только к маршрутам и информации о походах;  </w:t>
+      </w:r>
+    </w:p>
+    <w:p>
+      <w:r>
+        <w:t xml:space="preserve">●      кораблестроитель — доступ только к данным корабля и ресурсам строительства;  </w:t>
+      </w:r>
+    </w:p>
+    <w:p>
+      <w:r>
+        <w:t xml:space="preserve">●      воины — доступ только к подтверждению участия;  </w:t>
+      </w:r>
+    </w:p>
+    <w:p>
+      <w:r>
+        <w:t xml:space="preserve">●      жители деревни — доступ только к управлению ресурсами;  </w:t>
+      </w:r>
+    </w:p>
+    <w:p>
+      <w:r>
+        <w:t xml:space="preserve">●      жрец — доступ только к информации о походе и подтверждению благословения.  </w:t>
       </w:r>
     </w:p>
     <w:p>
@@ -2723,7 +3248,22 @@
     </w:p>
     <w:p>
       <w:r>
-        <w:t xml:space="preserve">FR-03 [UC2]: Система должна отображать статус готовности похода (ресурсы, команда, корабль, маршрут).  </w:t>
+        <w:t xml:space="preserve">NFR-03: Для пользователей с ролями воин, житель деревни и жрец следующие действия должны выполняться на одном экране без перехода между разделами:  </w:t>
+      </w:r>
+    </w:p>
+    <w:p>
+      <w:r>
+        <w:t xml:space="preserve">●      подтверждение участия в походе;  </w:t>
+      </w:r>
+    </w:p>
+    <w:p>
+      <w:r>
+        <w:t xml:space="preserve">●      ввод данных о ресурсах;  </w:t>
+      </w:r>
+    </w:p>
+    <w:p>
+      <w:r>
+        <w:t xml:space="preserve">●      подтверждение благословения.  </w:t>
       </w:r>
     </w:p>
     <w:p>
@@ -2733,26 +3273,81 @@
     </w:p>
     <w:p>
       <w:r>
-        <w:t>FR-04 [UC3]: Система должна запрещать запуск похода при отсутствии обязательных условий.</w:t>
-      </w:r>
-    </w:p>
-    <w:p>
-      <w:pPr>
-        <w:pStyle w:val="Heading3"/>
-      </w:pPr>
-      <w:bookmarkStart w:id="15" w:name="_jqazpwguif35" w:colFirst="0" w:colLast="0"/>
-      <w:bookmarkEnd w:id="15"/>
+        <w:t xml:space="preserve">NFR-04: Главный экран ярла должен одновременно отображать:  </w:t>
+      </w:r>
+    </w:p>
+    <w:p>
+      <w:r>
+        <w:t xml:space="preserve">●      статус готовности команды;  </w:t>
+      </w:r>
+    </w:p>
+    <w:p>
+      <w:r>
+        <w:t xml:space="preserve">●      статус готовности корабля;  </w:t>
+      </w:r>
+    </w:p>
+    <w:p>
+      <w:r>
+        <w:t xml:space="preserve">●      объем доступных ресурсов;  </w:t>
+      </w:r>
+    </w:p>
+    <w:p>
+      <w:r>
+        <w:t xml:space="preserve">●      состояние маршрута;  </w:t>
+      </w:r>
+    </w:p>
+    <w:p>
+      <w:r>
+        <w:t xml:space="preserve">●      текущий статус похода.  </w:t>
+      </w:r>
+    </w:p>
+    <w:p>
+      <w:r>
+        <w:t xml:space="preserve">Получение этой информации не должно требовать перехода в другие разделы системы.  </w:t>
+      </w:r>
+    </w:p>
+    <w:p>
+      <w:r>
+        <w:t xml:space="preserve">   </w:t>
+      </w:r>
+    </w:p>
+    <w:p>
+      <w:r>
+        <w:t xml:space="preserve">NFR-05: Система должна отображать статусы походов, состояние корабля, наличие ресурсов и участие команды в виде таблиц, списков или индикаторов состояния.  </w:t>
+      </w:r>
+    </w:p>
+    <w:p>
+      <w:r>
+        <w:t xml:space="preserve">   </w:t>
+      </w:r>
+    </w:p>
+    <w:p>
+      <w:r>
+        <w:t xml:space="preserve">NFR-06: Базовый пользователь (воин, житель деревни, жрец) должен освоить выполнение своих основных действий не более чем за 1 час работы с системой.  </w:t>
+      </w:r>
+    </w:p>
+    <w:p>
+      <w:r>
+        <w:t xml:space="preserve">Продвинутый пользователь (ярл, навигатор, кораблестроитель) должен освоить основные функции системы не более чем за 8 часов практической работы. </w:t>
+      </w:r>
+    </w:p>
+    <w:p>
+      <w:pPr>
+        <w:pStyle w:val="Heading2"/>
+      </w:pPr>
+      <w:bookmarkStart w:id="21" w:name="_5dflceu2j5l1" w:colFirst="0" w:colLast="0"/>
+      <w:bookmarkEnd w:id="21"/>
       <w:r>
         <w:rPr>
           <w:b/>
           <w:bCs/>
         </w:rPr>
-        <w:t>3.1.2 Управление ресурсами</w:t>
-      </w:r>
-    </w:p>
-    <w:p>
-      <w:r>
-        <w:t xml:space="preserve">FR-05 [UC9]: Система должна отображать склад ресурсов.  </w:t>
+        <w:t>3.3 Reliability (Требования к надёжности)</w:t>
+      </w:r>
+    </w:p>
+    <w:p>
+      <w:r>
+        <w:t xml:space="preserve">NFR-07: Система должна быть доступна пользователям не менее 99% времени в течение календарного месяца, за исключением плановых технических работ.  </w:t>
       </w:r>
     </w:p>
     <w:p>
@@ -2762,7 +3357,7 @@
     </w:p>
     <w:p>
       <w:r>
-        <w:t xml:space="preserve">FR-06 [UC9]: Система должна позволять вводить и редактировать ресурсы.  </w:t>
+        <w:t>NFR-08: Система должна возвращать успешный результат изменяющей операции только после фиксации всех её изменений в постоянном хранилище. Подтверждённые изменения не должны теряться после перезапуска системы.</w:t>
       </w:r>
     </w:p>
     <w:p>
@@ -2772,7 +3367,7 @@
     </w:p>
     <w:p>
       <w:r>
-        <w:t xml:space="preserve">FR-07 [UC10, UC11]: Система должна учитывать распределение и резервирование ресурсов между походами и верфью.  </w:t>
+        <w:t xml:space="preserve">NFR-09: Операции, изменяющие несколько связанных сущностей, должны выполняться транзакционно. При ошибке выполнения изменения не должны сохраняться частично.  </w:t>
       </w:r>
     </w:p>
     <w:p>
@@ -2782,473 +3377,52 @@
     </w:p>
     <w:p>
       <w:r>
-        <w:t>FR-08 [UC3, UC11]: Система должна уведомлять о нехватке ресурсов в контексте операции (до выхода в море или до закрытия этапа постройки).</w:t>
-      </w:r>
-    </w:p>
-    <w:p>
-      <w:pPr>
-        <w:pStyle w:val="Heading3"/>
-      </w:pPr>
-      <w:bookmarkStart w:id="16" w:name="_by7fuplrn23w" w:colFirst="0" w:colLast="0"/>
-      <w:bookmarkEnd w:id="16"/>
+        <w:t xml:space="preserve">NFR-10: Система должна обеспечивать сохранность ранее зафиксированных данных при сбоях и перезапуске инфраструктуры.  </w:t>
+      </w:r>
+    </w:p>
+    <w:p>
+      <w:r>
+        <w:t xml:space="preserve">   </w:t>
+      </w:r>
+    </w:p>
+    <w:p>
+      <w:r>
+        <w:t>NFR-11: Система должна сохранять историю изменений походов, ресурсов и состава команды. Удаление исторических записей пользователями не допускается.</w:t>
+      </w:r>
+    </w:p>
+    <w:p>
+      <w:pPr>
+        <w:spacing w:before="160"/>
+      </w:pPr>
+      <w:r>
+        <w:t>NFR-12: Сервер должен определять поселение по авторизованной учётной записи, фиксировать его в сессии и применять ко всем операциям чтения и изменения бизнес-данных. Передача идентификатора объекта другого поселения не должна давать доступ к его данным.</w:t>
+      </w:r>
+    </w:p>
+    <w:p>
+      <w:pPr/>
+    </w:p>
+    <w:p>
+      <w:pPr>
+        <w:pStyle w:val="Heading2"/>
+      </w:pPr>
+      <w:bookmarkStart w:id="22" w:name="_cdueirv9qhz3" w:colFirst="0" w:colLast="0"/>
+      <w:bookmarkEnd w:id="22"/>
       <w:r>
         <w:rPr>
           <w:b/>
           <w:bCs/>
         </w:rPr>
-        <w:t>3.1.3 Управление командой</w:t>
-      </w:r>
-    </w:p>
-    <w:p>
-      <w:r>
-        <w:t xml:space="preserve">FR-09 [UC6]: Система должна позволять добавлять участников в поход.  </w:t>
-      </w:r>
-    </w:p>
-    <w:p>
-      <w:r>
-        <w:t xml:space="preserve">   </w:t>
-      </w:r>
-    </w:p>
-    <w:p>
-      <w:r>
-        <w:t xml:space="preserve">FR-10 [UC6]: Система должна позволять назначать роли.  </w:t>
-      </w:r>
-    </w:p>
-    <w:p>
-      <w:r>
-        <w:t xml:space="preserve">   </w:t>
-      </w:r>
-    </w:p>
-    <w:p>
-      <w:r>
-        <w:t xml:space="preserve">FR-11 [UC7]: Система должна фиксировать подтверждение участия.  </w:t>
-      </w:r>
-    </w:p>
-    <w:p>
-      <w:r>
-        <w:t xml:space="preserve">   </w:t>
-      </w:r>
-    </w:p>
-    <w:p>
-      <w:r>
-        <w:t>FR-12 [UC2, UC6]: Система должна отображать состав команды.</w:t>
-      </w:r>
-    </w:p>
-    <w:p>
-      <w:pPr>
-        <w:pStyle w:val="Heading3"/>
-      </w:pPr>
-      <w:bookmarkStart w:id="17" w:name="_addjkqrboi0s" w:colFirst="0" w:colLast="0"/>
-      <w:bookmarkEnd w:id="17"/>
-      <w:r>
-        <w:rPr>
-          <w:b/>
-          <w:bCs/>
-        </w:rPr>
-        <w:t>3.1.4 Планирование маршрута</w:t>
-      </w:r>
-    </w:p>
-    <w:p>
-      <w:r>
-        <w:t xml:space="preserve">FR-13 [UC8]: Система должна позволять задавать маршрут как список точек с описанием, привязанный к походу.  </w:t>
-      </w:r>
-    </w:p>
-    <w:p>
-      <w:r>
-        <w:t xml:space="preserve">   </w:t>
-      </w:r>
-    </w:p>
-    <w:p>
-      <w:r>
-        <w:lastRenderedPageBreak/>
-        <w:t xml:space="preserve">FR-14 [UC8]: Система должна отображать расстояние между точками.  </w:t>
-      </w:r>
-    </w:p>
-    <w:p>
-      <w:r>
-        <w:t xml:space="preserve">   </w:t>
-      </w:r>
-    </w:p>
-    <w:p>
-      <w:r>
-        <w:t xml:space="preserve">FR-15 [UC8]: Система должна позволять редактировать маршрут на этапе подготовки похода.  </w:t>
-      </w:r>
-    </w:p>
-    <w:p>
-      <w:r>
-        <w:t xml:space="preserve">   </w:t>
-      </w:r>
-    </w:p>
-    <w:p>
-      <w:r>
-        <w:t>FR-16 [UC8]: Система не должна использовать внешние картографические сервисы; маршрут задается вручную в системе.</w:t>
-      </w:r>
-    </w:p>
-    <w:p>
-      <w:pPr>
-        <w:pStyle w:val="Heading3"/>
-      </w:pPr>
-      <w:bookmarkStart w:id="18" w:name="_km5qb7gndxea" w:colFirst="0" w:colLast="0"/>
-      <w:bookmarkEnd w:id="18"/>
-      <w:r>
-        <w:rPr>
-          <w:b/>
-          <w:bCs/>
-        </w:rPr>
-        <w:t>3.1.5 Строительство корабля</w:t>
-      </w:r>
-    </w:p>
-    <w:p>
-      <w:r>
-        <w:t xml:space="preserve">FR-17 [UC11]: Система должна поддерживать поэтапное строительство корабля с видимой цепочкой этапов.  </w:t>
-      </w:r>
-    </w:p>
-    <w:p>
-      <w:r>
-        <w:t xml:space="preserve">   </w:t>
-      </w:r>
-    </w:p>
-    <w:p>
-      <w:r>
-        <w:t xml:space="preserve">FR-18 [UC11]: Система должна списывать ресурсы со склада при закрытии этапа.  </w:t>
-      </w:r>
-    </w:p>
-    <w:p>
-      <w:r>
-        <w:t xml:space="preserve">   </w:t>
-      </w:r>
-    </w:p>
-    <w:p>
-      <w:r>
-        <w:t xml:space="preserve">FR-19 [UC11]: Система должна требовать подтверждение этапов строительства.  </w:t>
-      </w:r>
-    </w:p>
-    <w:p>
-      <w:r>
-        <w:t xml:space="preserve">   </w:t>
-      </w:r>
-    </w:p>
-    <w:p>
-      <w:r>
-        <w:t>FR-20 [UC11, UC12]: Система должна запрещать завершение постройки без подтверждения благословения жрецом.</w:t>
-      </w:r>
-    </w:p>
-    <w:p>
-      <w:pPr>
-        <w:pStyle w:val="Heading3"/>
-      </w:pPr>
-      <w:bookmarkStart w:id="19" w:name="_td42nzyrzsey" w:colFirst="0" w:colLast="0"/>
-      <w:bookmarkEnd w:id="19"/>
-      <w:r>
-        <w:rPr>
-          <w:b/>
-          <w:bCs/>
-        </w:rPr>
-        <w:t>3.1.6 Учёт результатов</w:t>
-      </w:r>
-    </w:p>
-    <w:p>
-      <w:r>
-        <w:t xml:space="preserve">FR-21 [UC4]: Система должна фиксировать добычу по завершённому походу.  </w:t>
-      </w:r>
-    </w:p>
-    <w:p>
-      <w:r>
-        <w:t xml:space="preserve">   </w:t>
-      </w:r>
-    </w:p>
-    <w:p>
-      <w:r>
-        <w:t xml:space="preserve">FR-22 [UC4]: Система должна фиксировать потери.  </w:t>
-      </w:r>
-    </w:p>
-    <w:p>
-      <w:r>
-        <w:t xml:space="preserve">   </w:t>
-      </w:r>
-    </w:p>
-    <w:p>
-      <w:r>
-        <w:t xml:space="preserve">FR-23 [UC4]: Система должна рассчитывать распределение Вергельда (доли добычи участников по правилам поселения).  </w:t>
-      </w:r>
-    </w:p>
-    <w:p>
-      <w:r>
-        <w:t xml:space="preserve">   </w:t>
-      </w:r>
-    </w:p>
-    <w:p>
-      <w:r>
-        <w:t xml:space="preserve">FR-24 [UC5]: Система должна сохранять историю походов.  </w:t>
-      </w:r>
-    </w:p>
-    <w:p>
-      <w:r>
-        <w:t xml:space="preserve">   </w:t>
-      </w:r>
-    </w:p>
-    <w:p>
-      <w:r>
-        <w:t>FR-25 [UC4, UC5]: После фиксации итогов завершённого похода система должна запрещать изменение записи о добыче, потерях и распределении Вергельда пользователями согласно правилам неизменяемости (доступ на чтение — по ролям).</w:t>
-      </w:r>
-    </w:p>
-    <w:p>
-      <w:pPr>
-        <w:pStyle w:val="Heading2"/>
-      </w:pPr>
-      <w:bookmarkStart w:id="20" w:name="_82p2rm65c6tk" w:colFirst="0" w:colLast="0"/>
-      <w:bookmarkEnd w:id="20"/>
-      <w:r>
-        <w:rPr>
-          <w:b/>
-          <w:bCs/>
-        </w:rPr>
-        <w:t>3.2 Usability (Требования к удобству использования)</w:t>
-      </w:r>
-    </w:p>
-    <w:p>
-      <w:r>
-        <w:t xml:space="preserve">NFR-01: Для пользователей с ролями ярл, навигатор и кораблестроитель следующие действия должны выполняться не более чем за 2 перехода (клика) от главного экрана роли:  </w:t>
-      </w:r>
-    </w:p>
-    <w:p>
-      <w:r>
-        <w:t xml:space="preserve">●      создание похода;  </w:t>
-      </w:r>
-    </w:p>
-    <w:p>
-      <w:r>
-        <w:t xml:space="preserve">●      просмотр статуса экспедиции;  </w:t>
-      </w:r>
-    </w:p>
-    <w:p>
-      <w:r>
-        <w:t xml:space="preserve">●      редактирование маршрута;  </w:t>
-      </w:r>
-    </w:p>
-    <w:p>
-      <w:r>
-        <w:t xml:space="preserve">●      обновление состояния корабля.  </w:t>
-      </w:r>
-    </w:p>
-    <w:p>
-      <w:r>
-        <w:t xml:space="preserve">   </w:t>
-      </w:r>
-    </w:p>
-    <w:p>
-      <w:r>
-        <w:t xml:space="preserve">NFR-02: Система должна отображать пользователю только функции и данные, доступные его роли:  </w:t>
-      </w:r>
-    </w:p>
-    <w:p>
-      <w:r>
-        <w:t xml:space="preserve">●      ярл — полный доступ ко всем модулям;  </w:t>
-      </w:r>
-    </w:p>
-    <w:p>
-      <w:r>
-        <w:lastRenderedPageBreak/>
-        <w:t xml:space="preserve">●      навигатор — доступ только к маршрутам и информации о походах;  </w:t>
-      </w:r>
-    </w:p>
-    <w:p>
-      <w:r>
-        <w:t xml:space="preserve">●      кораблестроитель — доступ только к данным корабля и ресурсам строительства;  </w:t>
-      </w:r>
-    </w:p>
-    <w:p>
-      <w:r>
-        <w:t xml:space="preserve">●      воины — доступ только к подтверждению участия;  </w:t>
-      </w:r>
-    </w:p>
-    <w:p>
-      <w:r>
-        <w:t xml:space="preserve">●      жители деревни — доступ только к управлению ресурсами;  </w:t>
-      </w:r>
-    </w:p>
-    <w:p>
-      <w:r>
-        <w:t xml:space="preserve">●      жрец — доступ только к информации о походе и подтверждению благословения.  </w:t>
-      </w:r>
-    </w:p>
-    <w:p>
-      <w:r>
-        <w:t xml:space="preserve">   </w:t>
-      </w:r>
-    </w:p>
-    <w:p>
-      <w:r>
-        <w:t xml:space="preserve">NFR-03: Для пользователей с ролями воин, житель деревни и жрец следующие действия должны выполняться на одном экране без перехода между разделами:  </w:t>
-      </w:r>
-    </w:p>
-    <w:p>
-      <w:r>
-        <w:t xml:space="preserve">●      подтверждение участия в походе;  </w:t>
-      </w:r>
-    </w:p>
-    <w:p>
-      <w:r>
-        <w:t xml:space="preserve">●      ввод данных о ресурсах;  </w:t>
-      </w:r>
-    </w:p>
-    <w:p>
-      <w:r>
-        <w:t xml:space="preserve">●      подтверждение благословения.  </w:t>
-      </w:r>
-    </w:p>
-    <w:p>
-      <w:r>
-        <w:t xml:space="preserve">   </w:t>
-      </w:r>
-    </w:p>
-    <w:p>
-      <w:r>
-        <w:t xml:space="preserve">NFR-04: Главный экран ярла должен одновременно отображать:  </w:t>
-      </w:r>
-    </w:p>
-    <w:p>
-      <w:r>
-        <w:t xml:space="preserve">●      статус готовности команды;  </w:t>
-      </w:r>
-    </w:p>
-    <w:p>
-      <w:r>
-        <w:t xml:space="preserve">●      статус готовности корабля;  </w:t>
-      </w:r>
-    </w:p>
-    <w:p>
-      <w:r>
-        <w:t xml:space="preserve">●      объем доступных ресурсов;  </w:t>
-      </w:r>
-    </w:p>
-    <w:p>
-      <w:r>
-        <w:t xml:space="preserve">●      состояние маршрута;  </w:t>
-      </w:r>
-    </w:p>
-    <w:p>
-      <w:r>
-        <w:t xml:space="preserve">●      текущий статус похода.  </w:t>
-      </w:r>
-    </w:p>
-    <w:p>
-      <w:r>
-        <w:t xml:space="preserve">Получение этой информации не должно требовать перехода в другие разделы системы.  </w:t>
-      </w:r>
-    </w:p>
-    <w:p>
-      <w:r>
-        <w:t xml:space="preserve">   </w:t>
-      </w:r>
-    </w:p>
-    <w:p>
-      <w:r>
-        <w:t xml:space="preserve">NFR-05: Система должна отображать статусы походов, состояние корабля, наличие ресурсов и участие команды в виде таблиц, списков или индикаторов состояния.  </w:t>
-      </w:r>
-    </w:p>
-    <w:p>
-      <w:r>
-        <w:t xml:space="preserve">   </w:t>
-      </w:r>
-    </w:p>
-    <w:p>
-      <w:r>
-        <w:t xml:space="preserve">NFR-06: Базовый пользователь (воин, житель деревни, жрец) должен освоить выполнение своих основных действий не более чем за 1 час работы с системой.  </w:t>
-      </w:r>
-    </w:p>
-    <w:p>
-      <w:r>
-        <w:t xml:space="preserve">Продвинутый пользователь (ярл, навигатор, кораблестроитель) должен освоить основные функции системы не более чем за 8 часов практической работы. </w:t>
-      </w:r>
-    </w:p>
-    <w:p>
-      <w:pPr>
-        <w:pStyle w:val="Heading2"/>
-      </w:pPr>
-      <w:bookmarkStart w:id="21" w:name="_5dflceu2j5l1" w:colFirst="0" w:colLast="0"/>
-      <w:bookmarkEnd w:id="21"/>
-      <w:r>
-        <w:rPr>
-          <w:b/>
-          <w:bCs/>
-        </w:rPr>
-        <w:t>3.3 Reliability (Требования к надёжности)</w:t>
-      </w:r>
-    </w:p>
-    <w:p>
-      <w:r>
-        <w:t xml:space="preserve">NFR-07: Система должна быть доступна пользователям не менее 99% времени в течение календарного месяца, за исключением плановых технических работ.  </w:t>
-      </w:r>
-    </w:p>
-    <w:p>
-      <w:r>
-        <w:t xml:space="preserve">   </w:t>
-      </w:r>
-    </w:p>
-    <w:p>
-      <w:r>
-        <w:t>NFR-08: Система должна возвращать успешный результат изменяющей операции только после фиксации всех её изменений в постоянном хранилище. Подтверждённые изменения не должны теряться после перезапуска системы.</w:t>
-      </w:r>
-    </w:p>
-    <w:p>
-      <w:r>
-        <w:t xml:space="preserve">   </w:t>
-      </w:r>
-    </w:p>
-    <w:p>
-      <w:r>
-        <w:t xml:space="preserve">NFR-09: Операции, изменяющие несколько связанных сущностей, должны выполняться транзакционно. При ошибке выполнения изменения не должны сохраняться частично.  </w:t>
-      </w:r>
-    </w:p>
-    <w:p>
-      <w:r>
-        <w:t xml:space="preserve">   </w:t>
-      </w:r>
-    </w:p>
-    <w:p>
-      <w:r>
-        <w:t xml:space="preserve">NFR-10: Система должна обеспечивать сохранность ранее зафиксированных данных при сбоях и перезапуске инфраструктуры.  </w:t>
-      </w:r>
-    </w:p>
-    <w:p>
-      <w:r>
-        <w:t xml:space="preserve">   </w:t>
-      </w:r>
-    </w:p>
-    <w:p>
-      <w:r>
-        <w:t>NFR-11: Система должна сохранять историю изменений походов, ресурсов и состава команды. Удаление исторических записей пользователями не допускается.</w:t>
-      </w:r>
-    </w:p>
-    <w:p>
-      <w:pPr>
-        <w:pStyle w:val="Heading2"/>
-      </w:pPr>
-      <w:bookmarkStart w:id="22" w:name="_cdueirv9qhz3" w:colFirst="0" w:colLast="0"/>
-      <w:bookmarkEnd w:id="22"/>
-      <w:r>
-        <w:rPr>
-          <w:b/>
-          <w:bCs/>
-        </w:rPr>
         <w:lastRenderedPageBreak/>
         <w:t>3.4 Performance (Требования к производительности)</w:t>
       </w:r>
     </w:p>
     <w:p>
       <w:r>
-        <w:t>NFR-12: Время обработки пользовательских запросов не должно превышать:</w:t>
-      </w:r>
-      <w:r>
+        <w:t>NFR-13: Время обработки пользовательских запросов не должно превышать:</w:t>
         <w:br/>
         <w:t>● 1 секунду для 95% запросов;</w:t>
-      </w:r>
-      <w:r>
         <w:br/>
         <w:t>● 2 секунды для 100% запросов.</w:t>
-      </w:r>
-      <w:r>
         <w:br/>
         <w:t>Измерение производится от момента отправки HTTP-запроса клиентом до получения полного ответа от сервера.</w:t>
       </w:r>
@@ -3266,23 +3440,13 @@
     </w:p>
     <w:p>
       <w:r>
-        <w:t>NFR-13: Время выполнения операций загрузки и обработки данных должно составлять:</w:t>
-      </w:r>
-      <w:r>
+        <w:t>NFR-14: Время выполнения операций загрузки и обработки данных должно составлять:</w:t>
         <w:br/>
         <w:t>● загрузка списка походов объёмом до 100 записей — не более 2 секунд;</w:t>
-      </w:r>
-      <w:r>
         <w:br/>
         <w:t>● загрузка списка ресурсов склада объёмом до 100 записей — не более 2 секунд;</w:t>
-      </w:r>
-      <w:r>
-        <w:br/>
-      </w:r>
-      <w:r>
+        <w:br/>
         <w:t>● поиск походов по названию или статусу — не более 2 секунд.</w:t>
-      </w:r>
-      <w:r>
         <w:br/>
         <w:t>Показатели измеряются от момента отправки HTTP-запроса клиентом до получения полного ответа от сервера.</w:t>
       </w:r>
@@ -3300,30 +3464,36 @@
     </w:p>
     <w:p>
       <w:r>
-        <w:t>NFR-14: Система должна обеспечивать выполнение требований, указанных в NFR-12 и NFR-13, при:</w:t>
-      </w:r>
-      <w:r>
+        <w:t>NFR-15: Система должна обеспечивать выполнение требований, указанных в NFR-13 и NFR-14, при:</w:t>
         <w:br/>
         <w:t>● одновременной работе до 50 пользователей (пиковая нагрузка при массовом подтверждении участия в походе);</w:t>
-      </w:r>
-      <w:r>
         <w:br/>
         <w:t>● интенсивности до 30 HTTP-запросов в минуту от одного пользователя.</w:t>
       </w:r>
     </w:p>
     <w:p>
-      <w:r>
-        <w:t>NFR-15 [UC3, UC4, UC7, UC11]: Повторная отправка одной и той же изменяющей команды не должна создавать повторные списания ресурсов, распределения Вергельда, подтверждения участия или переходы состояний.</w:t>
-      </w:r>
-    </w:p>
-    <w:p>
-      <w:r>
-        <w:t>NFR-16 [UC3, UC7, UC11]: При конкурентном изменении одного похода, состава команды, резерва или этапа строительства система должна обнаруживать конфликт и не допускать потери изменений или отрицательных остатков. Пользователю должно возвращаться актуальное состояние.</w:t>
-      </w:r>
-    </w:p>
-    <w:p>
-      <w:r>
-        <w:t>NFR-17 [UC3, UC4, UC7, UC11]: Для критических переходов система должна сохранять пользователя, время, идентификатор объекта, исходное и новое состояние, а также результат операции. Пользовательское удаление этих записей не допускается.</w:t>
+      <w:pPr>
+        <w:keepLines/>
+      </w:pPr>
+      <w:r>
+        <w:t>NFR-16 [UC3, UC4, UC7, UC11]: Повторная отправка одной и той же изменяющей команды не должна создавать повторные списания ресурсов, распределения Вергельда, подтверждения участия или переходы состояний.</w:t>
+      </w:r>
+    </w:p>
+    <w:p>
+      <w:pPr>
+        <w:keepLines/>
+      </w:pPr>
+      <w:r>
+        <w:t>NFR-17 [UC3, UC7, UC11]: При конкурентном изменении одного похода, состава команды, резерва или этапа строительства система должна обнаруживать конфликт и не допускать потери изменений или отрицательных остатков. Пользователю должно возвращаться актуальное состояние.</w:t>
+      </w:r>
+    </w:p>
+    <w:p>
+      <w:pPr>
+        <w:keepLines/>
+        <w:pageBreakBefore w:val="0"/>
+      </w:pPr>
+      <w:r>
+        <w:t>NFR-18 [UC3, UC4, UC7, UC11]: Для критических переходов система должна сохранять пользователя, время, идентификатор объекта, исходное и новое состояние, а также результат операции. Пользовательское удаление этих записей не допускается.</w:t>
       </w:r>
     </w:p>
     <w:p>
@@ -3452,10 +3622,8 @@
     <w:p>
       <w:r>
         <w:t>3.5.4 Хранение данных</w:t>
-      </w:r>
-      <w:r>
-        <w:br/>
-        <w:t>Система должна использовать PostgreSQL 16. В PostgreSQL должны храниться прикладные данные, учётные записи пользователей, уникальные логины, хэши паролей, статусы учётных записей, роли и связи пользователей с ролями. Аутентификация и авторизация должны реализовываться серверной частью приложения без внешнего сервера идентификации. Пароли не должны храниться в открытом виде; допускается только хранение стойкого к перебору хэша с индивидуальной солью. Серверная часть должна проверять учётные данные и права доступа при каждом защищённом запросе.</w:t>
+        <w:br/>
+        <w:t>Система должна использовать PostgreSQL 16. В PostgreSQL должны храниться прикладные данные, учётные записи пользователей, уникальные логины, хэши паролей, статусы учётных записей, роли и связи пользователей с ролями. Серверная часть должна обеспечивать авторизацию пользователей и проверять права доступа при каждом защищённом запросе. Пароли не должны храниться в открытом виде; допускается только хранение стойкого к перебору хэша с индивидуальной солью.</w:t>
       </w:r>
     </w:p>
     <w:p>
@@ -3804,6 +3972,7 @@
       <w:tr>
         <w:trPr>
           <w:tblHeader/>
+          <w:cantSplit/>
         </w:trPr>
         <w:tc>
           <w:tcPr>
@@ -3911,6 +4080,9 @@
         </w:tc>
       </w:tr>
       <w:tr>
+        <w:trPr>
+          <w:cantSplit/>
+        </w:trPr>
         <w:tc>
           <w:tcPr>
             <w:tcW w:w="2257" w:type="dxa"/>
@@ -3977,6 +4149,9 @@
         </w:tc>
       </w:tr>
       <w:tr>
+        <w:trPr>
+          <w:cantSplit/>
+        </w:trPr>
         <w:tc>
           <w:tcPr>
             <w:tcW w:w="2257" w:type="dxa"/>
@@ -4043,6 +4218,9 @@
         </w:tc>
       </w:tr>
       <w:tr>
+        <w:trPr>
+          <w:cantSplit/>
+        </w:trPr>
         <w:tc>
           <w:tcPr>
             <w:tcW w:w="2257" w:type="dxa"/>
@@ -4109,6 +4287,9 @@
         </w:tc>
       </w:tr>
       <w:tr>
+        <w:trPr>
+          <w:cantSplit/>
+        </w:trPr>
         <w:tc>
           <w:tcPr>
             <w:tcW w:w="2257" w:type="dxa"/>
@@ -4175,6 +4356,9 @@
         </w:tc>
       </w:tr>
       <w:tr>
+        <w:trPr>
+          <w:cantSplit/>
+        </w:trPr>
         <w:tc>
           <w:tcPr>
             <w:tcW w:w="2257" w:type="dxa"/>
@@ -4385,15 +4569,12 @@
           <w:szCs w:val="22"/>
         </w:rPr>
       </w:pPr>
-      <w:bookmarkStart w:id="38" w:name="_ew4jqc7m40s3" w:colFirst="0" w:colLast="0"/>
-      <w:bookmarkEnd w:id="38"/>
       <w:r>
         <w:rPr>
           <w:color w:val="000000"/>
           <w:sz w:val="22"/>
-          <w:szCs w:val="22"/>
-        </w:rPr>
-        <w:t>● Встроенный модуль аутентификации и ролевого доступа серверной части;</w:t>
+        </w:rPr>
+        <w:t>● Серверная авторизация и управление ролями пользователей;</w:t>
       </w:r>
     </w:p>
     <w:p>

</xml_diff>